<commit_message>
docs: expand handover to full UMR project
</commit_message>
<xml_diff>
--- a/docs/UMR_Projektuebergabe_2026-08-18.docx
+++ b/docs/UMR_Projektuebergabe_2026-08-18.docx
@@ -1587,6 +1587,1496 @@
         <w:t>Keine losgelösten Teile, Schnitte, Z-Fighting- oder Clipping-Artefakte.</w:t>
       </w:r>
     </w:p>
+    <w:p>
+      <w:r>
+        <w:br w:type="page"/>
+      </w:r>
+    </w:p>
+    <w:p>
+      <w:pPr>
+        <w:pStyle w:val="Heading1"/>
+      </w:pPr>
+      <w:r>
+        <w:t>9. Gesamtprojekt – nicht nur Kronen</w:t>
+      </w:r>
+    </w:p>
+    <w:p>
+      <w:pPr>
+        <w:spacing w:after="200"/>
+      </w:pPr>
+      <w:r>
+        <w:t>Dieser ergänzte Teil dokumentiert den gesamten bearbeiteten UMR-Umfang. Das Repository umfasst aktuell 137 Java-Quelldateien, 614 Ressourcen, 297 Dateien unter Modelle und 19 Python-Testmodule. Die visuelle Arbeit betrifft Kreaturen, Rüstungen, Kronen, Items, Texturen, Animationen, Sounds und Laufzeitintegration.</w:t>
+      </w:r>
+    </w:p>
+    <w:tbl>
+      <w:tblPr>
+        <w:tblStyle w:val="TableGrid"/>
+        <w:tblW w:type="dxa" w:w="9360"/>
+        <w:jc w:val="left"/>
+        <w:tblLayout w:type="fixed"/>
+        <w:tblLook w:firstColumn="1" w:firstRow="1" w:lastColumn="0" w:lastRow="0" w:noHBand="0" w:noVBand="1" w:val="04A0"/>
+        <w:tblInd w:w="120" w:type="dxa"/>
+      </w:tblPr>
+      <w:tblGrid>
+        <w:gridCol w:w="1800"/>
+        <w:gridCol w:w="3900"/>
+        <w:gridCol w:w="3660"/>
+      </w:tblGrid>
+      <w:tr>
+        <w:tc>
+          <w:tcPr>
+            <w:tcW w:type="dxa" w:w="1800"/>
+            <w:shd w:fill="E8EEF5"/>
+            <w:vAlign w:val="center"/>
+            <w:tcMar>
+              <w:top w:w="80" w:type="dxa"/>
+              <w:bottom w:w="80" w:type="dxa"/>
+              <w:start w:w="120" w:type="dxa"/>
+              <w:end w:w="120" w:type="dxa"/>
+            </w:tcMar>
+          </w:tcPr>
+          <w:p>
+            <w:r>
+              <w:rPr>
+                <w:rFonts w:ascii="Calibri" w:hAnsi="Calibri"/>
+                <w:b/>
+                <w:i w:val="0"/>
+                <w:color w:val="1F4D78"/>
+                <w:sz w:val="20"/>
+              </w:rPr>
+              <w:t>Teilbereich</w:t>
+            </w:r>
+          </w:p>
+        </w:tc>
+        <w:tc>
+          <w:tcPr>
+            <w:tcW w:type="dxa" w:w="3900"/>
+            <w:shd w:fill="E8EEF5"/>
+            <w:vAlign w:val="center"/>
+            <w:tcMar>
+              <w:top w:w="80" w:type="dxa"/>
+              <w:bottom w:w="80" w:type="dxa"/>
+              <w:start w:w="120" w:type="dxa"/>
+              <w:end w:w="120" w:type="dxa"/>
+            </w:tcMar>
+          </w:tcPr>
+          <w:p>
+            <w:r>
+              <w:rPr>
+                <w:rFonts w:ascii="Calibri" w:hAnsi="Calibri"/>
+                <w:b/>
+                <w:i w:val="0"/>
+                <w:color w:val="1F4D78"/>
+                <w:sz w:val="20"/>
+              </w:rPr>
+              <w:t>Vorhandener Stand</w:t>
+            </w:r>
+          </w:p>
+        </w:tc>
+        <w:tc>
+          <w:tcPr>
+            <w:tcW w:type="dxa" w:w="3660"/>
+            <w:shd w:fill="E8EEF5"/>
+            <w:vAlign w:val="center"/>
+            <w:tcMar>
+              <w:top w:w="80" w:type="dxa"/>
+              <w:bottom w:w="80" w:type="dxa"/>
+              <w:start w:w="120" w:type="dxa"/>
+              <w:end w:w="120" w:type="dxa"/>
+            </w:tcMar>
+          </w:tcPr>
+          <w:p>
+            <w:r>
+              <w:rPr>
+                <w:rFonts w:ascii="Calibri" w:hAnsi="Calibri"/>
+                <w:b/>
+                <w:i w:val="0"/>
+                <w:color w:val="1F4D78"/>
+                <w:sz w:val="20"/>
+              </w:rPr>
+              <w:t>Noch erforderlich</w:t>
+            </w:r>
+          </w:p>
+        </w:tc>
+      </w:tr>
+      <w:tr>
+        <w:tc>
+          <w:tcPr>
+            <w:tcW w:type="dxa" w:w="1800"/>
+            <w:vAlign w:val="center"/>
+            <w:tcMar>
+              <w:top w:w="80" w:type="dxa"/>
+              <w:bottom w:w="80" w:type="dxa"/>
+              <w:start w:w="120" w:type="dxa"/>
+              <w:end w:w="120" w:type="dxa"/>
+            </w:tcMar>
+          </w:tcPr>
+          <w:p>
+            <w:pPr>
+              <w:spacing w:after="0"/>
+            </w:pPr>
+            <w:r>
+              <w:rPr>
+                <w:rFonts w:ascii="Calibri" w:hAnsi="Calibri"/>
+                <w:b/>
+                <w:i w:val="0"/>
+                <w:color w:val="181F2A"/>
+                <w:sz w:val="18"/>
+              </w:rPr>
+              <w:t>Corrupted Silverfish</w:t>
+            </w:r>
+          </w:p>
+        </w:tc>
+        <w:tc>
+          <w:tcPr>
+            <w:tcW w:type="dxa" w:w="3900"/>
+            <w:vAlign w:val="center"/>
+            <w:tcMar>
+              <w:top w:w="80" w:type="dxa"/>
+              <w:bottom w:w="80" w:type="dxa"/>
+              <w:start w:w="120" w:type="dxa"/>
+              <w:end w:w="120" w:type="dxa"/>
+            </w:tcMar>
+          </w:tcPr>
+          <w:p>
+            <w:pPr>
+              <w:spacing w:after="0"/>
+            </w:pPr>
+            <w:r>
+              <w:rPr>
+                <w:rFonts w:ascii="Calibri" w:hAnsi="Calibri"/>
+                <w:b w:val="0"/>
+                <w:i w:val="0"/>
+                <w:color w:val="181F2A"/>
+                <w:sz w:val="18"/>
+              </w:rPr>
+              <w:t>Tripo-Quelle, v5-Mesh, Texturen, fünf Animationen, Glow, Sounds und Hitbox-Arbeit vorhanden.</w:t>
+            </w:r>
+          </w:p>
+        </w:tc>
+        <w:tc>
+          <w:tcPr>
+            <w:tcW w:type="dxa" w:w="3660"/>
+            <w:vAlign w:val="center"/>
+            <w:tcMar>
+              <w:top w:w="80" w:type="dxa"/>
+              <w:bottom w:w="80" w:type="dxa"/>
+              <w:start w:w="120" w:type="dxa"/>
+              <w:end w:w="120" w:type="dxa"/>
+            </w:tcMar>
+          </w:tcPr>
+          <w:p>
+            <w:pPr>
+              <w:spacing w:after="0"/>
+            </w:pPr>
+            <w:r>
+              <w:rPr>
+                <w:rFonts w:ascii="Calibri" w:hAnsi="Calibri"/>
+                <w:b w:val="0"/>
+                <w:i w:val="0"/>
+                <w:color w:val="181F2A"/>
+                <w:sz w:val="18"/>
+              </w:rPr>
+              <w:t>Echter bewegter Clienttest, finale Naht-/Laufrichtungsabnahme und Produktionsfreigabe.</w:t>
+            </w:r>
+          </w:p>
+        </w:tc>
+      </w:tr>
+      <w:tr>
+        <w:tc>
+          <w:tcPr>
+            <w:tcW w:type="dxa" w:w="1800"/>
+            <w:vAlign w:val="center"/>
+            <w:tcMar>
+              <w:top w:w="80" w:type="dxa"/>
+              <w:bottom w:w="80" w:type="dxa"/>
+              <w:start w:w="120" w:type="dxa"/>
+              <w:end w:w="120" w:type="dxa"/>
+            </w:tcMar>
+          </w:tcPr>
+          <w:p>
+            <w:pPr>
+              <w:spacing w:after="0"/>
+            </w:pPr>
+            <w:r>
+              <w:rPr>
+                <w:rFonts w:ascii="Calibri" w:hAnsi="Calibri"/>
+                <w:b/>
+                <w:i w:val="0"/>
+                <w:color w:val="181F2A"/>
+                <w:sz w:val="18"/>
+              </w:rPr>
+              <w:t>Rüstungsfamilien</w:t>
+            </w:r>
+          </w:p>
+        </w:tc>
+        <w:tc>
+          <w:tcPr>
+            <w:tcW w:type="dxa" w:w="3900"/>
+            <w:vAlign w:val="center"/>
+            <w:tcMar>
+              <w:top w:w="80" w:type="dxa"/>
+              <w:bottom w:w="80" w:type="dxa"/>
+              <w:start w:w="120" w:type="dxa"/>
+              <w:end w:w="120" w:type="dxa"/>
+            </w:tcMar>
+          </w:tcPr>
+          <w:p>
+            <w:pPr>
+              <w:spacing w:after="0"/>
+            </w:pPr>
+            <w:r>
+              <w:rPr>
+                <w:rFonts w:ascii="Calibri" w:hAnsi="Calibri"/>
+                <w:b w:val="0"/>
+                <w:i w:val="0"/>
+                <w:color w:val="181F2A"/>
+                <w:sz w:val="18"/>
+              </w:rPr>
+              <w:t>Void, Celestial, Living und Balance mit Helm, Brustplatte, Hose und Stiefeln konzipiert.</w:t>
+            </w:r>
+          </w:p>
+        </w:tc>
+        <w:tc>
+          <w:tcPr>
+            <w:tcW w:type="dxa" w:w="3660"/>
+            <w:vAlign w:val="center"/>
+            <w:tcMar>
+              <w:top w:w="80" w:type="dxa"/>
+              <w:bottom w:w="80" w:type="dxa"/>
+              <w:start w:w="120" w:type="dxa"/>
+              <w:end w:w="120" w:type="dxa"/>
+            </w:tcMar>
+          </w:tcPr>
+          <w:p>
+            <w:pPr>
+              <w:spacing w:after="0"/>
+            </w:pPr>
+            <w:r>
+              <w:rPr>
+                <w:rFonts w:ascii="Calibri" w:hAnsi="Calibri"/>
+                <w:b w:val="0"/>
+                <w:i w:val="0"/>
+                <w:color w:val="181F2A"/>
+                <w:sz w:val="18"/>
+              </w:rPr>
+              <w:t>High-Poly-Quellen sauber auf Spieler-Bones übertragen; keine automatische Tausend-Würfel-Konvertierung.</w:t>
+            </w:r>
+          </w:p>
+        </w:tc>
+      </w:tr>
+      <w:tr>
+        <w:tc>
+          <w:tcPr>
+            <w:tcW w:type="dxa" w:w="1800"/>
+            <w:vAlign w:val="center"/>
+            <w:tcMar>
+              <w:top w:w="80" w:type="dxa"/>
+              <w:bottom w:w="80" w:type="dxa"/>
+              <w:start w:w="120" w:type="dxa"/>
+              <w:end w:w="120" w:type="dxa"/>
+            </w:tcMar>
+          </w:tcPr>
+          <w:p>
+            <w:pPr>
+              <w:spacing w:after="0"/>
+            </w:pPr>
+            <w:r>
+              <w:rPr>
+                <w:rFonts w:ascii="Calibri" w:hAnsi="Calibri"/>
+                <w:b/>
+                <w:i w:val="0"/>
+                <w:color w:val="181F2A"/>
+                <w:sz w:val="18"/>
+              </w:rPr>
+              <w:t>Kronen</w:t>
+            </w:r>
+          </w:p>
+        </w:tc>
+        <w:tc>
+          <w:tcPr>
+            <w:tcW w:type="dxa" w:w="3900"/>
+            <w:vAlign w:val="center"/>
+            <w:tcMar>
+              <w:top w:w="80" w:type="dxa"/>
+              <w:bottom w:w="80" w:type="dxa"/>
+              <w:start w:w="120" w:type="dxa"/>
+              <w:end w:w="120" w:type="dxa"/>
+            </w:tcMar>
+          </w:tcPr>
+          <w:p>
+            <w:pPr>
+              <w:spacing w:after="0"/>
+            </w:pPr>
+            <w:r>
+              <w:rPr>
+                <w:rFonts w:ascii="Calibri" w:hAnsi="Calibri"/>
+                <w:b w:val="0"/>
+                <w:i w:val="0"/>
+                <w:color w:val="181F2A"/>
+                <w:sz w:val="18"/>
+              </w:rPr>
+              <w:t>Vier Familien, Kampf-/Royal-Form, Rezepte, Items und acht generierte Assets.</w:t>
+            </w:r>
+          </w:p>
+        </w:tc>
+        <w:tc>
+          <w:tcPr>
+            <w:tcW w:type="dxa" w:w="3660"/>
+            <w:vAlign w:val="center"/>
+            <w:tcMar>
+              <w:top w:w="80" w:type="dxa"/>
+              <w:bottom w:w="80" w:type="dxa"/>
+              <w:start w:w="120" w:type="dxa"/>
+              <w:end w:w="120" w:type="dxa"/>
+            </w:tcMar>
+          </w:tcPr>
+          <w:p>
+            <w:pPr>
+              <w:spacing w:after="0"/>
+            </w:pPr>
+            <w:r>
+              <w:rPr>
+                <w:rFonts w:ascii="Calibri" w:hAnsi="Calibri"/>
+                <w:b w:val="0"/>
+                <w:i w:val="0"/>
+                <w:color w:val="181F2A"/>
+                <w:sz w:val="18"/>
+              </w:rPr>
+              <w:t>Zwei Generator-Fixes, Curio-/Helmposition und Clientabnahme.</w:t>
+            </w:r>
+          </w:p>
+        </w:tc>
+      </w:tr>
+      <w:tr>
+        <w:tc>
+          <w:tcPr>
+            <w:tcW w:type="dxa" w:w="1800"/>
+            <w:vAlign w:val="center"/>
+            <w:tcMar>
+              <w:top w:w="80" w:type="dxa"/>
+              <w:bottom w:w="80" w:type="dxa"/>
+              <w:start w:w="120" w:type="dxa"/>
+              <w:end w:w="120" w:type="dxa"/>
+            </w:tcMar>
+          </w:tcPr>
+          <w:p>
+            <w:pPr>
+              <w:spacing w:after="0"/>
+            </w:pPr>
+            <w:r>
+              <w:rPr>
+                <w:rFonts w:ascii="Calibri" w:hAnsi="Calibri"/>
+                <w:b/>
+                <w:i w:val="0"/>
+                <w:color w:val="181F2A"/>
+                <w:sz w:val="18"/>
+              </w:rPr>
+              <w:t>Items und Inventargrafiken</w:t>
+            </w:r>
+          </w:p>
+        </w:tc>
+        <w:tc>
+          <w:tcPr>
+            <w:tcW w:type="dxa" w:w="3900"/>
+            <w:vAlign w:val="center"/>
+            <w:tcMar>
+              <w:top w:w="80" w:type="dxa"/>
+              <w:bottom w:w="80" w:type="dxa"/>
+              <w:start w:w="120" w:type="dxa"/>
+              <w:end w:w="120" w:type="dxa"/>
+            </w:tcMar>
+          </w:tcPr>
+          <w:p>
+            <w:pPr>
+              <w:spacing w:after="0"/>
+            </w:pPr>
+            <w:r>
+              <w:rPr>
+                <w:rFonts w:ascii="Calibri" w:hAnsi="Calibri"/>
+                <w:b w:val="0"/>
+                <w:i w:val="0"/>
+                <w:color w:val="181F2A"/>
+                <w:sz w:val="18"/>
+              </w:rPr>
+              <w:t>Getrennte Itemmodelle und Texturen sowie frühere Forge-Aufnahmen vorhanden.</w:t>
+            </w:r>
+          </w:p>
+        </w:tc>
+        <w:tc>
+          <w:tcPr>
+            <w:tcW w:type="dxa" w:w="3660"/>
+            <w:vAlign w:val="center"/>
+            <w:tcMar>
+              <w:top w:w="80" w:type="dxa"/>
+              <w:bottom w:w="80" w:type="dxa"/>
+              <w:start w:w="120" w:type="dxa"/>
+              <w:end w:w="120" w:type="dxa"/>
+            </w:tcMar>
+          </w:tcPr>
+          <w:p>
+            <w:pPr>
+              <w:spacing w:after="0"/>
+            </w:pPr>
+            <w:r>
+              <w:rPr>
+                <w:rFonts w:ascii="Calibri" w:hAnsi="Calibri"/>
+                <w:b w:val="0"/>
+                <w:i w:val="0"/>
+                <w:color w:val="181F2A"/>
+                <w:sz w:val="18"/>
+              </w:rPr>
+              <w:t>Alle Icons und Handansichten familienweise gegen gleiche Qualitätskriterien prüfen.</w:t>
+            </w:r>
+          </w:p>
+        </w:tc>
+      </w:tr>
+      <w:tr>
+        <w:tc>
+          <w:tcPr>
+            <w:tcW w:type="dxa" w:w="1800"/>
+            <w:vAlign w:val="center"/>
+            <w:tcMar>
+              <w:top w:w="80" w:type="dxa"/>
+              <w:bottom w:w="80" w:type="dxa"/>
+              <w:start w:w="120" w:type="dxa"/>
+              <w:end w:w="120" w:type="dxa"/>
+            </w:tcMar>
+          </w:tcPr>
+          <w:p>
+            <w:pPr>
+              <w:spacing w:after="0"/>
+            </w:pPr>
+            <w:r>
+              <w:rPr>
+                <w:rFonts w:ascii="Calibri" w:hAnsi="Calibri"/>
+                <w:b/>
+                <w:i w:val="0"/>
+                <w:color w:val="181F2A"/>
+                <w:sz w:val="18"/>
+              </w:rPr>
+              <w:t>Audio</w:t>
+            </w:r>
+          </w:p>
+        </w:tc>
+        <w:tc>
+          <w:tcPr>
+            <w:tcW w:type="dxa" w:w="3900"/>
+            <w:vAlign w:val="center"/>
+            <w:tcMar>
+              <w:top w:w="80" w:type="dxa"/>
+              <w:bottom w:w="80" w:type="dxa"/>
+              <w:start w:w="120" w:type="dxa"/>
+              <w:end w:w="120" w:type="dxa"/>
+            </w:tcMar>
+          </w:tcPr>
+          <w:p>
+            <w:pPr>
+              <w:spacing w:after="0"/>
+            </w:pPr>
+            <w:r>
+              <w:rPr>
+                <w:rFonts w:ascii="Calibri" w:hAnsi="Calibri"/>
+                <w:b w:val="0"/>
+                <w:i w:val="0"/>
+                <w:color w:val="181F2A"/>
+                <w:sz w:val="18"/>
+              </w:rPr>
+              <w:t>Corrupted-Silverfish-Soundarbeit wurde integriert bzw. vorbereitet.</w:t>
+            </w:r>
+          </w:p>
+        </w:tc>
+        <w:tc>
+          <w:tcPr>
+            <w:tcW w:type="dxa" w:w="3660"/>
+            <w:vAlign w:val="center"/>
+            <w:tcMar>
+              <w:top w:w="80" w:type="dxa"/>
+              <w:bottom w:w="80" w:type="dxa"/>
+              <w:start w:w="120" w:type="dxa"/>
+              <w:end w:w="120" w:type="dxa"/>
+            </w:tcMar>
+          </w:tcPr>
+          <w:p>
+            <w:pPr>
+              <w:spacing w:after="0"/>
+            </w:pPr>
+            <w:r>
+              <w:rPr>
+                <w:rFonts w:ascii="Calibri" w:hAnsi="Calibri"/>
+                <w:b w:val="0"/>
+                <w:i w:val="0"/>
+                <w:color w:val="181F2A"/>
+                <w:sz w:val="18"/>
+              </w:rPr>
+              <w:t>Im echten Client Lautstärke, Loop, Abstand und Ereigniszuordnung kontrollieren.</w:t>
+            </w:r>
+          </w:p>
+        </w:tc>
+      </w:tr>
+      <w:tr>
+        <w:tc>
+          <w:tcPr>
+            <w:tcW w:type="dxa" w:w="1800"/>
+            <w:vAlign w:val="center"/>
+            <w:tcMar>
+              <w:top w:w="80" w:type="dxa"/>
+              <w:bottom w:w="80" w:type="dxa"/>
+              <w:start w:w="120" w:type="dxa"/>
+              <w:end w:w="120" w:type="dxa"/>
+            </w:tcMar>
+          </w:tcPr>
+          <w:p>
+            <w:pPr>
+              <w:spacing w:after="0"/>
+            </w:pPr>
+            <w:r>
+              <w:rPr>
+                <w:rFonts w:ascii="Calibri" w:hAnsi="Calibri"/>
+                <w:b/>
+                <w:i w:val="0"/>
+                <w:color w:val="181F2A"/>
+                <w:sz w:val="18"/>
+              </w:rPr>
+              <w:t>Build/Release</w:t>
+            </w:r>
+          </w:p>
+        </w:tc>
+        <w:tc>
+          <w:tcPr>
+            <w:tcW w:type="dxa" w:w="3900"/>
+            <w:vAlign w:val="center"/>
+            <w:tcMar>
+              <w:top w:w="80" w:type="dxa"/>
+              <w:bottom w:w="80" w:type="dxa"/>
+              <w:start w:w="120" w:type="dxa"/>
+              <w:end w:w="120" w:type="dxa"/>
+            </w:tcMar>
+          </w:tcPr>
+          <w:p>
+            <w:pPr>
+              <w:spacing w:after="0"/>
+            </w:pPr>
+            <w:r>
+              <w:rPr>
+                <w:rFonts w:ascii="Calibri" w:hAnsi="Calibri"/>
+                <w:b w:val="0"/>
+                <w:i w:val="0"/>
+                <w:color w:val="181F2A"/>
+                <w:sz w:val="18"/>
+              </w:rPr>
+              <w:t>Umfangreiche statische und Python-Verträge vorhanden.</w:t>
+            </w:r>
+          </w:p>
+        </w:tc>
+        <w:tc>
+          <w:tcPr>
+            <w:tcW w:type="dxa" w:w="3660"/>
+            <w:vAlign w:val="center"/>
+            <w:tcMar>
+              <w:top w:w="80" w:type="dxa"/>
+              <w:bottom w:w="80" w:type="dxa"/>
+              <w:start w:w="120" w:type="dxa"/>
+              <w:end w:w="120" w:type="dxa"/>
+            </w:tcMar>
+          </w:tcPr>
+          <w:p>
+            <w:pPr>
+              <w:spacing w:after="0"/>
+            </w:pPr>
+            <w:r>
+              <w:rPr>
+                <w:rFonts w:ascii="Calibri" w:hAnsi="Calibri"/>
+                <w:b w:val="0"/>
+                <w:i w:val="0"/>
+                <w:color w:val="181F2A"/>
+                <w:sz w:val="18"/>
+              </w:rPr>
+              <w:t>Gradle 8.8 kompilieren, RunClient prüfen, Release-Diff und GitHub-CI abschliessen.</w:t>
+            </w:r>
+          </w:p>
+        </w:tc>
+      </w:tr>
+    </w:tbl>
+    <w:p>
+      <w:pPr>
+        <w:pStyle w:val="Heading1"/>
+      </w:pPr>
+      <w:r>
+        <w:t>10. Corrupted Silverfish</w:t>
+      </w:r>
+    </w:p>
+    <w:p>
+      <w:pPr>
+        <w:pStyle w:val="ListBullet"/>
+        <w:spacing w:after="160" w:line="280" w:lineRule="auto"/>
+      </w:pPr>
+      <w:r>
+        <w:rPr>
+          <w:rFonts w:ascii="Calibri" w:hAnsi="Calibri"/>
+          <w:b w:val="0"/>
+          <w:i w:val="0"/>
+          <w:color w:val="181F2A"/>
+          <w:sz w:val="22"/>
+        </w:rPr>
+        <w:t>Das gute visuelle Ergebnis stammt aus einer Tripo-High-Poly-Quelle und nicht aus einer simplen Bild-zu-Würfel-Automatik.</w:t>
+      </w:r>
+    </w:p>
+    <w:p>
+      <w:pPr>
+        <w:pStyle w:val="ListBullet"/>
+        <w:spacing w:after="160" w:line="280" w:lineRule="auto"/>
+      </w:pPr>
+      <w:r>
+        <w:rPr>
+          <w:rFonts w:ascii="Calibri" w:hAnsi="Calibri"/>
+          <w:b w:val="0"/>
+          <w:i w:val="0"/>
+          <w:color w:val="181F2A"/>
+          <w:sz w:val="22"/>
+        </w:rPr>
+        <w:t>Die Runtime-Struktur enthält Entity, Renderer, Model, Custom Mesh, Glow Layer, Tracker und Events.</w:t>
+      </w:r>
+    </w:p>
+    <w:p>
+      <w:pPr>
+        <w:pStyle w:val="ListBullet"/>
+        <w:spacing w:after="160" w:line="280" w:lineRule="auto"/>
+      </w:pPr>
+      <w:r>
+        <w:rPr>
+          <w:rFonts w:ascii="Calibri" w:hAnsi="Calibri"/>
+          <w:b w:val="0"/>
+          <w:i w:val="0"/>
+          <w:color w:val="181F2A"/>
+          <w:sz w:val="22"/>
+        </w:rPr>
+        <w:t>Die Asset-Pipeline besitzt Geometrie, Grundtextur, Glowmask, fünf Animationen, Validator und Preview-Pack.</w:t>
+      </w:r>
+    </w:p>
+    <w:p>
+      <w:pPr>
+        <w:pStyle w:val="ListBullet"/>
+        <w:spacing w:after="160" w:line="280" w:lineRule="auto"/>
+      </w:pPr>
+      <w:r>
+        <w:rPr>
+          <w:rFonts w:ascii="Calibri" w:hAnsi="Calibri"/>
+          <w:b w:val="0"/>
+          <w:i w:val="0"/>
+          <w:color w:val="181F2A"/>
+          <w:sz w:val="22"/>
+        </w:rPr>
+        <w:t>Bekannte Qualitätsregeln: geschlossene Körperhülle, keine Schnittnaht durch den Torso, natürliche Tripod-Beinbewegung und korrekte Vorwärtsrichtung.</w:t>
+      </w:r>
+    </w:p>
+    <w:p>
+      <w:pPr>
+        <w:pStyle w:val="ListBullet"/>
+        <w:spacing w:after="160" w:line="280" w:lineRule="auto"/>
+      </w:pPr>
+      <w:r>
+        <w:rPr>
+          <w:rFonts w:ascii="Calibri" w:hAnsi="Calibri"/>
+          <w:b w:val="0"/>
+          <w:i w:val="0"/>
+          <w:color w:val="181F2A"/>
+          <w:sz w:val="22"/>
+        </w:rPr>
+        <w:t>Hitbox und Sounds müssen immer im echten Forge-Client zusammen mit dem sichtbaren Modell kontrolliert werden.</w:t>
+      </w:r>
+    </w:p>
+    <w:p>
+      <w:pPr>
+        <w:jc w:val="center"/>
+      </w:pPr>
+      <w:r>
+        <w:drawing>
+          <wp:inline xmlns:a="http://schemas.openxmlformats.org/drawingml/2006/main" xmlns:pic="http://schemas.openxmlformats.org/drawingml/2006/picture">
+            <wp:extent cx="5029200" cy="4122130"/>
+            <wp:docPr id="3" name="Picture 3"/>
+            <wp:cNvGraphicFramePr>
+              <a:graphicFrameLocks noChangeAspect="1"/>
+            </wp:cNvGraphicFramePr>
+            <a:graphic>
+              <a:graphicData uri="http://schemas.openxmlformats.org/drawingml/2006/picture">
+                <pic:pic>
+                  <pic:nvPicPr>
+                    <pic:cNvPr id="0" name="Corrupted Silverfish v5 Tripo Mesh.png"/>
+                    <pic:cNvPicPr/>
+                  </pic:nvPicPr>
+                  <pic:blipFill>
+                    <a:blip r:embed="rId13"/>
+                    <a:stretch>
+                      <a:fillRect/>
+                    </a:stretch>
+                  </pic:blipFill>
+                  <pic:spPr>
+                    <a:xfrm>
+                      <a:off x="0" y="0"/>
+                      <a:ext cx="5029200" cy="4122130"/>
+                    </a:xfrm>
+                    <a:prstGeom prst="rect"/>
+                  </pic:spPr>
+                </pic:pic>
+              </a:graphicData>
+            </a:graphic>
+          </wp:inline>
+        </w:drawing>
+      </w:r>
+    </w:p>
+    <w:p>
+      <w:pPr>
+        <w:spacing w:after="200"/>
+        <w:jc w:val="center"/>
+      </w:pPr>
+      <w:r>
+        <w:rPr>
+          <w:rFonts w:ascii="Calibri" w:hAnsi="Calibri"/>
+          <w:b w:val="0"/>
+          <w:i/>
+          <w:color w:val="5C6674"/>
+          <w:sz w:val="18"/>
+        </w:rPr>
+        <w:t>Abbildung 3: Lokale Tripo-/Mesh-Referenz des Corrupted Silverfish.</w:t>
+      </w:r>
+    </w:p>
+    <w:p>
+      <w:pPr>
+        <w:pStyle w:val="Heading1"/>
+      </w:pPr>
+      <w:r>
+        <w:t>11. Tripo-Rüstungsquellen</w:t>
+      </w:r>
+    </w:p>
+    <w:p>
+      <w:pPr>
+        <w:spacing w:after="160"/>
+      </w:pPr>
+      <w:r>
+        <w:t>Die gleiche Tripo-Webseite wie beim Silverfish wurde bereits am 16. August 2026 verwendet. Im Konto sind 16 Rüstungsprojekte dokumentiert: vier Familien × vier Teile. Lokal liegen 15 originale GLB-Dateien mit jeweils rund 3,0–3,5 MB vor; beim True-Void-Helm liegt eine Retopo-FBX-Datei vor. Ein erneutes Generieren würde Credits verbrauchen, ohne die eigentliche Ursache zu lösen.</w:t>
+      </w:r>
+    </w:p>
+    <w:p>
+      <w:pPr>
+        <w:pStyle w:val="ListBullet"/>
+        <w:spacing w:after="160" w:line="280" w:lineRule="auto"/>
+      </w:pPr>
+      <w:r>
+        <w:rPr>
+          <w:rFonts w:ascii="Calibri" w:hAnsi="Calibri"/>
+          <w:b w:val="0"/>
+          <w:i w:val="0"/>
+          <w:color w:val="181F2A"/>
+          <w:sz w:val="22"/>
+        </w:rPr>
+        <w:t>Designquelle: die vorhandenen Tripo-High-Poly-Modelle und ihre Texturen.</w:t>
+      </w:r>
+    </w:p>
+    <w:p>
+      <w:pPr>
+        <w:pStyle w:val="ListBullet"/>
+        <w:spacing w:after="160" w:line="280" w:lineRule="auto"/>
+      </w:pPr>
+      <w:r>
+        <w:rPr>
+          <w:rFonts w:ascii="Calibri" w:hAnsi="Calibri"/>
+          <w:b w:val="0"/>
+          <w:i w:val="0"/>
+          <w:color w:val="181F2A"/>
+          <w:sz w:val="22"/>
+        </w:rPr>
+        <w:t>Nicht geeignet: die vorhandene automatische Voxelkonvertierung mit etwa 756 bis 2.194 Cuboids pro Teil.</w:t>
+      </w:r>
+    </w:p>
+    <w:p>
+      <w:pPr>
+        <w:pStyle w:val="ListBullet"/>
+        <w:spacing w:after="160" w:line="280" w:lineRule="auto"/>
+      </w:pPr>
+      <w:r>
+        <w:rPr>
+          <w:rFonts w:ascii="Calibri" w:hAnsi="Calibri"/>
+          <w:b w:val="0"/>
+          <w:i w:val="0"/>
+          <w:color w:val="181F2A"/>
+          <w:sz w:val="22"/>
+        </w:rPr>
+        <w:t>Ziel: pro Rüstungsteil eine kontrollierte, reduzierte Blockbench-Geometrie mit klaren Player-Bone-Zuordnungen.</w:t>
+      </w:r>
+    </w:p>
+    <w:p>
+      <w:pPr>
+        <w:pStyle w:val="ListBullet"/>
+        <w:spacing w:after="160" w:line="280" w:lineRule="auto"/>
+      </w:pPr>
+      <w:r>
+        <w:rPr>
+          <w:rFonts w:ascii="Calibri" w:hAnsi="Calibri"/>
+          <w:b w:val="0"/>
+          <w:i w:val="0"/>
+          <w:color w:val="181F2A"/>
+          <w:sz w:val="22"/>
+        </w:rPr>
+        <w:t>Helm → head; Brust → body + getrennte Schulterteile; Hose → body + beide Beine; Stiefel → getrennte Beine.</w:t>
+      </w:r>
+    </w:p>
+    <w:p>
+      <w:pPr>
+        <w:pStyle w:val="ListBullet"/>
+        <w:spacing w:after="160" w:line="280" w:lineRule="auto"/>
+      </w:pPr>
+      <w:r>
+        <w:rPr>
+          <w:rFonts w:ascii="Calibri" w:hAnsi="Calibri"/>
+          <w:b w:val="0"/>
+          <w:i w:val="0"/>
+          <w:color w:val="181F2A"/>
+          <w:sz w:val="22"/>
+        </w:rPr>
+        <w:t>Jede Familie behält Silhouette, Materialpalette, Edelsteine und asymmetrische Designdetails ihrer Tripo-Quelle.</w:t>
+      </w:r>
+    </w:p>
+    <w:p>
+      <w:pPr>
+        <w:jc w:val="center"/>
+      </w:pPr>
+      <w:r>
+        <w:drawing>
+          <wp:inline xmlns:a="http://schemas.openxmlformats.org/drawingml/2006/main" xmlns:pic="http://schemas.openxmlformats.org/drawingml/2006/picture">
+            <wp:extent cx="5715000" cy="5715000"/>
+            <wp:docPr id="4" name="Picture 4"/>
+            <wp:cNvGraphicFramePr>
+              <a:graphicFrameLocks noChangeAspect="1"/>
+            </wp:cNvGraphicFramePr>
+            <a:graphic>
+              <a:graphicData uri="http://schemas.openxmlformats.org/drawingml/2006/picture">
+                <pic:pic>
+                  <pic:nvPicPr>
+                    <pic:cNvPr id="0" name="conversion-contact-sheet.png"/>
+                    <pic:cNvPicPr/>
+                  </pic:nvPicPr>
+                  <pic:blipFill>
+                    <a:blip r:embed="rId14"/>
+                    <a:stretch>
+                      <a:fillRect/>
+                    </a:stretch>
+                  </pic:blipFill>
+                  <pic:spPr>
+                    <a:xfrm>
+                      <a:off x="0" y="0"/>
+                      <a:ext cx="5715000" cy="5715000"/>
+                    </a:xfrm>
+                    <a:prstGeom prst="rect"/>
+                  </pic:spPr>
+                </pic:pic>
+              </a:graphicData>
+            </a:graphic>
+          </wp:inline>
+        </w:drawing>
+      </w:r>
+    </w:p>
+    <w:p>
+      <w:pPr>
+        <w:spacing w:after="200"/>
+        <w:jc w:val="center"/>
+      </w:pPr>
+      <w:r>
+        <w:rPr>
+          <w:rFonts w:ascii="Calibri" w:hAnsi="Calibri"/>
+          <w:b w:val="0"/>
+          <w:i/>
+          <w:color w:val="5C6674"/>
+          <w:sz w:val="18"/>
+        </w:rPr>
+        <w:t>Abbildung 4: Bestehende automatische Würfelkonvertierung – nützlich als Formreferenz, aber zu komplex für die Produktion.</w:t>
+      </w:r>
+    </w:p>
+    <w:p>
+      <w:pPr>
+        <w:pStyle w:val="Heading1"/>
+      </w:pPr>
+      <w:r>
+        <w:t>12. Qualitätsziel für alle Rüstungsfamilien</w:t>
+      </w:r>
+    </w:p>
+    <w:tbl>
+      <w:tblPr>
+        <w:tblStyle w:val="TableGrid"/>
+        <w:tblW w:type="dxa" w:w="9360"/>
+        <w:jc w:val="left"/>
+        <w:tblLayout w:type="fixed"/>
+        <w:tblLook w:firstColumn="1" w:firstRow="1" w:lastColumn="0" w:lastRow="0" w:noHBand="0" w:noVBand="1" w:val="04A0"/>
+        <w:tblInd w:w="120" w:type="dxa"/>
+      </w:tblPr>
+      <w:tblGrid>
+        <w:gridCol w:w="2100"/>
+        <w:gridCol w:w="7260"/>
+      </w:tblGrid>
+      <w:tr>
+        <w:tc>
+          <w:tcPr>
+            <w:tcW w:type="dxa" w:w="2100"/>
+            <w:shd w:fill="E8EEF5"/>
+            <w:vAlign w:val="center"/>
+            <w:tcMar>
+              <w:top w:w="80" w:type="dxa"/>
+              <w:bottom w:w="80" w:type="dxa"/>
+              <w:start w:w="120" w:type="dxa"/>
+              <w:end w:w="120" w:type="dxa"/>
+            </w:tcMar>
+          </w:tcPr>
+          <w:p>
+            <w:r>
+              <w:rPr>
+                <w:rFonts w:ascii="Calibri" w:hAnsi="Calibri"/>
+                <w:b/>
+                <w:i w:val="0"/>
+                <w:color w:val="1F4D78"/>
+                <w:sz w:val="20"/>
+              </w:rPr>
+              <w:t>Prüfung</w:t>
+            </w:r>
+          </w:p>
+        </w:tc>
+        <w:tc>
+          <w:tcPr>
+            <w:tcW w:type="dxa" w:w="7260"/>
+            <w:shd w:fill="E8EEF5"/>
+            <w:vAlign w:val="center"/>
+            <w:tcMar>
+              <w:top w:w="80" w:type="dxa"/>
+              <w:bottom w:w="80" w:type="dxa"/>
+              <w:start w:w="120" w:type="dxa"/>
+              <w:end w:w="120" w:type="dxa"/>
+            </w:tcMar>
+          </w:tcPr>
+          <w:p>
+            <w:r>
+              <w:rPr>
+                <w:rFonts w:ascii="Calibri" w:hAnsi="Calibri"/>
+                <w:b/>
+                <w:i w:val="0"/>
+                <w:color w:val="1F4D78"/>
+                <w:sz w:val="20"/>
+              </w:rPr>
+              <w:t>Abnahmekriterium</w:t>
+            </w:r>
+          </w:p>
+        </w:tc>
+      </w:tr>
+      <w:tr>
+        <w:tc>
+          <w:tcPr>
+            <w:tcW w:type="dxa" w:w="2100"/>
+            <w:vAlign w:val="center"/>
+            <w:tcMar>
+              <w:top w:w="80" w:type="dxa"/>
+              <w:bottom w:w="80" w:type="dxa"/>
+              <w:start w:w="120" w:type="dxa"/>
+              <w:end w:w="120" w:type="dxa"/>
+            </w:tcMar>
+          </w:tcPr>
+          <w:p>
+            <w:pPr>
+              <w:spacing w:after="0"/>
+            </w:pPr>
+            <w:r>
+              <w:rPr>
+                <w:rFonts w:ascii="Calibri" w:hAnsi="Calibri"/>
+                <w:b/>
+                <w:i w:val="0"/>
+                <w:color w:val="181F2A"/>
+                <w:sz w:val="18"/>
+              </w:rPr>
+              <w:t>Formtreue</w:t>
+            </w:r>
+          </w:p>
+        </w:tc>
+        <w:tc>
+          <w:tcPr>
+            <w:tcW w:type="dxa" w:w="7260"/>
+            <w:vAlign w:val="center"/>
+            <w:tcMar>
+              <w:top w:w="80" w:type="dxa"/>
+              <w:bottom w:w="80" w:type="dxa"/>
+              <w:start w:w="120" w:type="dxa"/>
+              <w:end w:w="120" w:type="dxa"/>
+            </w:tcMar>
+          </w:tcPr>
+          <w:p>
+            <w:pPr>
+              <w:spacing w:after="0"/>
+            </w:pPr>
+            <w:r>
+              <w:rPr>
+                <w:rFonts w:ascii="Calibri" w:hAnsi="Calibri"/>
+                <w:b w:val="0"/>
+                <w:i w:val="0"/>
+                <w:color w:val="181F2A"/>
+                <w:sz w:val="18"/>
+              </w:rPr>
+              <w:t>Front, Rücken, Seite und Perspektive entsprechen der Tripo-Quelle deutlich.</w:t>
+            </w:r>
+          </w:p>
+        </w:tc>
+      </w:tr>
+      <w:tr>
+        <w:tc>
+          <w:tcPr>
+            <w:tcW w:type="dxa" w:w="2100"/>
+            <w:vAlign w:val="center"/>
+            <w:tcMar>
+              <w:top w:w="80" w:type="dxa"/>
+              <w:bottom w:w="80" w:type="dxa"/>
+              <w:start w:w="120" w:type="dxa"/>
+              <w:end w:w="120" w:type="dxa"/>
+            </w:tcMar>
+          </w:tcPr>
+          <w:p>
+            <w:pPr>
+              <w:spacing w:after="0"/>
+            </w:pPr>
+            <w:r>
+              <w:rPr>
+                <w:rFonts w:ascii="Calibri" w:hAnsi="Calibri"/>
+                <w:b/>
+                <w:i w:val="0"/>
+                <w:color w:val="181F2A"/>
+                <w:sz w:val="18"/>
+              </w:rPr>
+              <w:t>Spielerpassform</w:t>
+            </w:r>
+          </w:p>
+        </w:tc>
+        <w:tc>
+          <w:tcPr>
+            <w:tcW w:type="dxa" w:w="7260"/>
+            <w:vAlign w:val="center"/>
+            <w:tcMar>
+              <w:top w:w="80" w:type="dxa"/>
+              <w:bottom w:w="80" w:type="dxa"/>
+              <w:start w:w="120" w:type="dxa"/>
+              <w:end w:w="120" w:type="dxa"/>
+            </w:tcMar>
+          </w:tcPr>
+          <w:p>
+            <w:pPr>
+              <w:spacing w:after="0"/>
+            </w:pPr>
+            <w:r>
+              <w:rPr>
+                <w:rFonts w:ascii="Calibri" w:hAnsi="Calibri"/>
+                <w:b w:val="0"/>
+                <w:i w:val="0"/>
+                <w:color w:val="181F2A"/>
+                <w:sz w:val="18"/>
+              </w:rPr>
+              <w:t>Keine schwebenden Teile; saubere Lage auf Kopf, Torso, Armen und Beinen.</w:t>
+            </w:r>
+          </w:p>
+        </w:tc>
+      </w:tr>
+      <w:tr>
+        <w:tc>
+          <w:tcPr>
+            <w:tcW w:type="dxa" w:w="2100"/>
+            <w:vAlign w:val="center"/>
+            <w:tcMar>
+              <w:top w:w="80" w:type="dxa"/>
+              <w:bottom w:w="80" w:type="dxa"/>
+              <w:start w:w="120" w:type="dxa"/>
+              <w:end w:w="120" w:type="dxa"/>
+            </w:tcMar>
+          </w:tcPr>
+          <w:p>
+            <w:pPr>
+              <w:spacing w:after="0"/>
+            </w:pPr>
+            <w:r>
+              <w:rPr>
+                <w:rFonts w:ascii="Calibri" w:hAnsi="Calibri"/>
+                <w:b/>
+                <w:i w:val="0"/>
+                <w:color w:val="181F2A"/>
+                <w:sz w:val="18"/>
+              </w:rPr>
+              <w:t>Animation</w:t>
+            </w:r>
+          </w:p>
+        </w:tc>
+        <w:tc>
+          <w:tcPr>
+            <w:tcW w:type="dxa" w:w="7260"/>
+            <w:vAlign w:val="center"/>
+            <w:tcMar>
+              <w:top w:w="80" w:type="dxa"/>
+              <w:bottom w:w="80" w:type="dxa"/>
+              <w:start w:w="120" w:type="dxa"/>
+              <w:end w:w="120" w:type="dxa"/>
+            </w:tcMar>
+          </w:tcPr>
+          <w:p>
+            <w:pPr>
+              <w:spacing w:after="0"/>
+            </w:pPr>
+            <w:r>
+              <w:rPr>
+                <w:rFonts w:ascii="Calibri" w:hAnsi="Calibri"/>
+                <w:b w:val="0"/>
+                <w:i w:val="0"/>
+                <w:color w:val="181F2A"/>
+                <w:sz w:val="18"/>
+              </w:rPr>
+              <w:t>Schulter-, Bein- und Stiefelteile folgen den richtigen Humanoid-Bones ohne Schnitte.</w:t>
+            </w:r>
+          </w:p>
+        </w:tc>
+      </w:tr>
+      <w:tr>
+        <w:tc>
+          <w:tcPr>
+            <w:tcW w:type="dxa" w:w="2100"/>
+            <w:vAlign w:val="center"/>
+            <w:tcMar>
+              <w:top w:w="80" w:type="dxa"/>
+              <w:bottom w:w="80" w:type="dxa"/>
+              <w:start w:w="120" w:type="dxa"/>
+              <w:end w:w="120" w:type="dxa"/>
+            </w:tcMar>
+          </w:tcPr>
+          <w:p>
+            <w:pPr>
+              <w:spacing w:after="0"/>
+            </w:pPr>
+            <w:r>
+              <w:rPr>
+                <w:rFonts w:ascii="Calibri" w:hAnsi="Calibri"/>
+                <w:b/>
+                <w:i w:val="0"/>
+                <w:color w:val="181F2A"/>
+                <w:sz w:val="18"/>
+              </w:rPr>
+              <w:t>Textur</w:t>
+            </w:r>
+          </w:p>
+        </w:tc>
+        <w:tc>
+          <w:tcPr>
+            <w:tcW w:type="dxa" w:w="7260"/>
+            <w:vAlign w:val="center"/>
+            <w:tcMar>
+              <w:top w:w="80" w:type="dxa"/>
+              <w:bottom w:w="80" w:type="dxa"/>
+              <w:start w:w="120" w:type="dxa"/>
+              <w:end w:w="120" w:type="dxa"/>
+            </w:tcMar>
+          </w:tcPr>
+          <w:p>
+            <w:pPr>
+              <w:spacing w:after="0"/>
+            </w:pPr>
+            <w:r>
+              <w:rPr>
+                <w:rFonts w:ascii="Calibri" w:hAnsi="Calibri"/>
+                <w:b w:val="0"/>
+                <w:i w:val="0"/>
+                <w:color w:val="181F2A"/>
+                <w:sz w:val="18"/>
+              </w:rPr>
+              <w:t>Mehrere Materialschattierungen, klare Kanten, Nähte, Edelsteinkerne und keine flächige Einfarbigkeit.</w:t>
+            </w:r>
+          </w:p>
+        </w:tc>
+      </w:tr>
+      <w:tr>
+        <w:tc>
+          <w:tcPr>
+            <w:tcW w:type="dxa" w:w="2100"/>
+            <w:vAlign w:val="center"/>
+            <w:tcMar>
+              <w:top w:w="80" w:type="dxa"/>
+              <w:bottom w:w="80" w:type="dxa"/>
+              <w:start w:w="120" w:type="dxa"/>
+              <w:end w:w="120" w:type="dxa"/>
+            </w:tcMar>
+          </w:tcPr>
+          <w:p>
+            <w:pPr>
+              <w:spacing w:after="0"/>
+            </w:pPr>
+            <w:r>
+              <w:rPr>
+                <w:rFonts w:ascii="Calibri" w:hAnsi="Calibri"/>
+                <w:b/>
+                <w:i w:val="0"/>
+                <w:color w:val="181F2A"/>
+                <w:sz w:val="18"/>
+              </w:rPr>
+              <w:t>Performance</w:t>
+            </w:r>
+          </w:p>
+        </w:tc>
+        <w:tc>
+          <w:tcPr>
+            <w:tcW w:type="dxa" w:w="7260"/>
+            <w:vAlign w:val="center"/>
+            <w:tcMar>
+              <w:top w:w="80" w:type="dxa"/>
+              <w:bottom w:w="80" w:type="dxa"/>
+              <w:start w:w="120" w:type="dxa"/>
+              <w:end w:w="120" w:type="dxa"/>
+            </w:tcMar>
+          </w:tcPr>
+          <w:p>
+            <w:pPr>
+              <w:spacing w:after="0"/>
+            </w:pPr>
+            <w:r>
+              <w:rPr>
+                <w:rFonts w:ascii="Calibri" w:hAnsi="Calibri"/>
+                <w:b w:val="0"/>
+                <w:i w:val="0"/>
+                <w:color w:val="181F2A"/>
+                <w:sz w:val="18"/>
+              </w:rPr>
+              <w:t>Kontrollierte Cuboid-Zahl statt tausender Einzelwürfel; keine unnötigen Faces oder UV-Inseln.</w:t>
+            </w:r>
+          </w:p>
+        </w:tc>
+      </w:tr>
+      <w:tr>
+        <w:tc>
+          <w:tcPr>
+            <w:tcW w:type="dxa" w:w="2100"/>
+            <w:vAlign w:val="center"/>
+            <w:tcMar>
+              <w:top w:w="80" w:type="dxa"/>
+              <w:bottom w:w="80" w:type="dxa"/>
+              <w:start w:w="120" w:type="dxa"/>
+              <w:end w:w="120" w:type="dxa"/>
+            </w:tcMar>
+          </w:tcPr>
+          <w:p>
+            <w:pPr>
+              <w:spacing w:after="0"/>
+            </w:pPr>
+            <w:r>
+              <w:rPr>
+                <w:rFonts w:ascii="Calibri" w:hAnsi="Calibri"/>
+                <w:b/>
+                <w:i w:val="0"/>
+                <w:color w:val="181F2A"/>
+                <w:sz w:val="18"/>
+              </w:rPr>
+              <w:t>Client</w:t>
+            </w:r>
+          </w:p>
+        </w:tc>
+        <w:tc>
+          <w:tcPr>
+            <w:tcW w:type="dxa" w:w="7260"/>
+            <w:vAlign w:val="center"/>
+            <w:tcMar>
+              <w:top w:w="80" w:type="dxa"/>
+              <w:bottom w:w="80" w:type="dxa"/>
+              <w:start w:w="120" w:type="dxa"/>
+              <w:end w:w="120" w:type="dxa"/>
+            </w:tcMar>
+          </w:tcPr>
+          <w:p>
+            <w:pPr>
+              <w:spacing w:after="0"/>
+            </w:pPr>
+            <w:r>
+              <w:rPr>
+                <w:rFonts w:ascii="Calibri" w:hAnsi="Calibri"/>
+                <w:b w:val="0"/>
+                <w:i w:val="0"/>
+                <w:color w:val="181F2A"/>
+                <w:sz w:val="18"/>
+              </w:rPr>
+              <w:t>Inventar, Hand, getragen vorne/hinten und Bewegung im echten Forge-Client geprüft.</w:t>
+            </w:r>
+          </w:p>
+        </w:tc>
+      </w:tr>
+    </w:tbl>
+    <w:p>
+      <w:pPr>
+        <w:pStyle w:val="Heading1"/>
+      </w:pPr>
+      <w:r>
+        <w:t>13. Vollständiger Arbeitsplan</w:t>
+      </w:r>
+    </w:p>
+    <w:p>
+      <w:pPr>
+        <w:pStyle w:val="ListNumber"/>
+        <w:spacing w:after="160"/>
+      </w:pPr>
+      <w:r>
+        <w:rPr>
+          <w:rFonts w:ascii="Calibri" w:hAnsi="Calibri"/>
+          <w:b w:val="0"/>
+          <w:i w:val="0"/>
+          <w:color w:val="181F2A"/>
+          <w:sz w:val="22"/>
+        </w:rPr>
+        <w:t>Alle 16 Tripo-Quellen unveränderlich archivieren und Hash, Polygone, Bounds, UVs und Lizenz dokumentieren.</w:t>
+      </w:r>
+    </w:p>
+    <w:p>
+      <w:pPr>
+        <w:pStyle w:val="ListNumber"/>
+        <w:spacing w:after="160"/>
+      </w:pPr>
+      <w:r>
+        <w:rPr>
+          <w:rFonts w:ascii="Calibri" w:hAnsi="Calibri"/>
+          <w:b w:val="0"/>
+          <w:i w:val="0"/>
+          <w:color w:val="181F2A"/>
+          <w:sz w:val="22"/>
+        </w:rPr>
+        <w:t>True-Void-Helm-Original vollständig sichern und zusammen mit den 15 GLBs auditieren.</w:t>
+      </w:r>
+    </w:p>
+    <w:p>
+      <w:pPr>
+        <w:pStyle w:val="ListNumber"/>
+        <w:spacing w:after="160"/>
+      </w:pPr>
+      <w:r>
+        <w:rPr>
+          <w:rFonts w:ascii="Calibri" w:hAnsi="Calibri"/>
+          <w:b w:val="0"/>
+          <w:i w:val="0"/>
+          <w:color w:val="181F2A"/>
+          <w:sz w:val="22"/>
+        </w:rPr>
+        <w:t>Je Familie zuerst Helm und Brustplatte als Qualitätsreferenz sauber in Blockbench nachbauen.</w:t>
+      </w:r>
+    </w:p>
+    <w:p>
+      <w:pPr>
+        <w:pStyle w:val="ListNumber"/>
+        <w:spacing w:after="160"/>
+      </w:pPr>
+      <w:r>
+        <w:rPr>
+          <w:rFonts w:ascii="Calibri" w:hAnsi="Calibri"/>
+          <w:b w:val="0"/>
+          <w:i w:val="0"/>
+          <w:color w:val="181F2A"/>
+          <w:sz w:val="22"/>
+        </w:rPr>
+        <w:t>Nach visueller Abnahme Hosen und Stiefel mit denselben Proportionen, Paletten und UV-Regeln erstellen.</w:t>
+      </w:r>
+    </w:p>
+    <w:p>
+      <w:pPr>
+        <w:pStyle w:val="ListNumber"/>
+        <w:spacing w:after="160"/>
+      </w:pPr>
+      <w:r>
+        <w:rPr>
+          <w:rFonts w:ascii="Calibri" w:hAnsi="Calibri"/>
+          <w:b w:val="0"/>
+          <w:i w:val="0"/>
+          <w:color w:val="181F2A"/>
+          <w:sz w:val="22"/>
+        </w:rPr>
+        <w:t>Kronen-Generator abschliessen und alle acht Formen im Curio-Slot integrieren.</w:t>
+      </w:r>
+    </w:p>
+    <w:p>
+      <w:pPr>
+        <w:pStyle w:val="ListNumber"/>
+        <w:spacing w:after="160"/>
+      </w:pPr>
+      <w:r>
+        <w:rPr>
+          <w:rFonts w:ascii="Calibri" w:hAnsi="Calibri"/>
+          <w:b w:val="0"/>
+          <w:i w:val="0"/>
+          <w:color w:val="181F2A"/>
+          <w:sz w:val="22"/>
+        </w:rPr>
+        <w:t>Silverfish-Bewegung, Sounds und Hitbox im echten Client final abnehmen.</w:t>
+      </w:r>
+    </w:p>
+    <w:p>
+      <w:pPr>
+        <w:pStyle w:val="ListNumber"/>
+        <w:spacing w:after="160"/>
+      </w:pPr>
+      <w:r>
+        <w:rPr>
+          <w:rFonts w:ascii="Calibri" w:hAnsi="Calibri"/>
+          <w:b w:val="0"/>
+          <w:i w:val="0"/>
+          <w:color w:val="181F2A"/>
+          <w:sz w:val="22"/>
+        </w:rPr>
+        <w:t>Alle Item-, Hand-, Front-, Rücken- und Bewegungsaufnahmen in einer einzigen Review-Seite zusammenführen.</w:t>
+      </w:r>
+    </w:p>
+    <w:p>
+      <w:pPr>
+        <w:pStyle w:val="ListNumber"/>
+        <w:spacing w:after="160"/>
+      </w:pPr>
+      <w:r>
+        <w:rPr>
+          <w:rFonts w:ascii="Calibri" w:hAnsi="Calibri"/>
+          <w:b w:val="0"/>
+          <w:i w:val="0"/>
+          <w:color w:val="181F2A"/>
+          <w:sz w:val="22"/>
+        </w:rPr>
+        <w:t>Gradle-Build und vollständige Test-Suite ausführen; erst danach Produktionsassets und Releasebranch freigeben.</w:t>
+      </w:r>
+    </w:p>
+    <w:p>
+      <w:pPr>
+        <w:pStyle w:val="Heading1"/>
+      </w:pPr>
+      <w:r>
+        <w:t>14. Repository- und Push-Status</w:t>
+      </w:r>
+    </w:p>
+    <w:p>
+      <w:pPr>
+        <w:spacing w:after="160"/>
+      </w:pPr>
+      <w:r>
+        <w:t>Der Word-Bericht ist im Commit be2710d enthalten. Das Ziel-Repository ist als Remote official eingerichtet. Ein Push des Feature-Branches wurde versucht, aber GitHub verweigerte dem aktuell angemeldeten Konto Momik-jpg den Schreibzugriff auf AleksZyro/UMR-Useless-mobs-reworked-Mod. Der lokale Stand ist nicht verloren; für den Push muss Momik-jpg als Mitarbeiter freigeschaltet oder der PC als AleksZyro authentifiziert werden.</w:t>
+      </w:r>
+    </w:p>
+    <w:p>
+      <w:pPr>
+        <w:pStyle w:val="Heading1"/>
+      </w:pPr>
+      <w:r>
+        <w:t>15. Freigabeentscheidung</w:t>
+      </w:r>
+    </w:p>
+    <w:p>
+      <w:pPr>
+        <w:ind w:left="259" w:right="259"/>
+      </w:pPr>
+      <w:r>
+        <w:rPr>
+          <w:rFonts w:ascii="Calibri" w:hAnsi="Calibri"/>
+          <w:b/>
+          <w:i w:val="0"/>
+          <w:color w:val="1F4D78"/>
+          <w:sz w:val="22"/>
+        </w:rPr>
+        <w:t>Empfehlung: Tripo nicht nochmals für alle Teile bezahlen. Die hochwertigen Quellen existieren bereits. Die nächste Arbeit muss die saubere Blockbench-/Player-Rig-Übertragung verbessern – genau dort entstand der sichtbare Qualitätsverlust.</w:t>
+      </w:r>
+    </w:p>
     <w:sectPr>
       <w:headerReference w:type="default" r:id="rId9"/>
       <w:footerReference w:type="default" r:id="rId10"/>

</xml_diff>